<commit_message>
python: lecciones con salidas reales (freeze), decisión del autor
Las 11 lecciones de python/ con código declaran execute.enabled: true
en su frontmatter (el _metadata.yml de sección es un hardlink del tema
y no se toca); freeze: true las ejecuta una vez y guarda el resultado
en _freeze/. Las dos celdas que piden datos con input() se muestran
sin ejecutar (#| eval: false). HTML y PDF/DOCX recompilados.

Co-Authored-By: Claude Opus 5.5 <noreply@anthropic.com>
</commit_message>
<xml_diff>
--- a/_site/python/2021-05-31-02-variables-expresiones-y-statements-con-python/index.docx
+++ b/_site/python/2021-05-31-02-variables-expresiones-y-statements-con-python/index.docx
@@ -217,7 +217,7 @@
         <w:t xml:space="preserve">Palabras clave</w:t>
       </w:r>
       <w:r>
-        <w:t xml:space="preserve">:</w:t>
+        <w:t xml:space="preserve">: keyword1, keyword2</w:t>
       </w:r>
     </w:p>
     <w:p>
@@ -1075,6 +1075,44 @@
         <w:t xml:space="preserve"># &lt;class 'bool'&gt;</w:t>
       </w:r>
     </w:p>
+    <w:p>
+      <w:pPr>
+        <w:pStyle w:val="SourceCode"/>
+      </w:pPr>
+      <w:r>
+        <w:rPr>
+          <w:rStyle w:val="VerbatimChar"/>
+        </w:rPr>
+        <w:t xml:space="preserve">&lt;class 'int'&gt;</w:t>
+      </w:r>
+      <w:r>
+        <w:br/>
+      </w:r>
+      <w:r>
+        <w:rPr>
+          <w:rStyle w:val="VerbatimChar"/>
+        </w:rPr>
+        <w:t xml:space="preserve">&lt;class 'float'&gt;</w:t>
+      </w:r>
+      <w:r>
+        <w:br/>
+      </w:r>
+      <w:r>
+        <w:rPr>
+          <w:rStyle w:val="VerbatimChar"/>
+        </w:rPr>
+        <w:t xml:space="preserve">&lt;class 'str'&gt;</w:t>
+      </w:r>
+      <w:r>
+        <w:br/>
+      </w:r>
+      <w:r>
+        <w:rPr>
+          <w:rStyle w:val="VerbatimChar"/>
+        </w:rPr>
+        <w:t xml:space="preserve">&lt;class 'bool'&gt;</w:t>
+      </w:r>
+    </w:p>
     <w:bookmarkEnd w:id="34"/>
     <w:bookmarkStart w:id="35" w:name="conversión-entre-tipos"/>
     <w:p>
@@ -1445,6 +1483,44 @@
     </w:p>
     <w:p>
       <w:pPr>
+        <w:pStyle w:val="SourceCode"/>
+      </w:pPr>
+      <w:r>
+        <w:rPr>
+          <w:rStyle w:val="VerbatimChar"/>
+        </w:rPr>
+        <w:t xml:space="preserve">3</w:t>
+      </w:r>
+      <w:r>
+        <w:br/>
+      </w:r>
+      <w:r>
+        <w:rPr>
+          <w:rStyle w:val="VerbatimChar"/>
+        </w:rPr>
+        <w:t xml:space="preserve">7.0</w:t>
+      </w:r>
+      <w:r>
+        <w:br/>
+      </w:r>
+      <w:r>
+        <w:rPr>
+          <w:rStyle w:val="VerbatimChar"/>
+        </w:rPr>
+        <w:t xml:space="preserve">El año es: 2023</w:t>
+      </w:r>
+      <w:r>
+        <w:br/>
+      </w:r>
+      <w:r>
+        <w:rPr>
+          <w:rStyle w:val="VerbatimChar"/>
+        </w:rPr>
+        <w:t xml:space="preserve">3.75</w:t>
+      </w:r>
+    </w:p>
+    <w:p>
+      <w:pPr>
         <w:pStyle w:val="FirstParagraph"/>
       </w:pPr>
       <w:r>
@@ -1703,6 +1779,53 @@
           <w:rStyle w:val="CommentTok"/>
         </w:rPr>
         <w:t xml:space="preserve"># Resultado: 4</w:t>
+      </w:r>
+    </w:p>
+    <w:p>
+      <w:pPr>
+        <w:pStyle w:val="SourceCode"/>
+      </w:pPr>
+      <w:r>
+        <w:rPr>
+          <w:rStyle w:val="VerbatimChar"/>
+        </w:rPr>
+        <w:t xml:space="preserve">4</w:t>
+      </w:r>
+      <w:r>
+        <w:br/>
+      </w:r>
+      <w:r>
+        <w:rPr>
+          <w:rStyle w:val="VerbatimChar"/>
+        </w:rPr>
+        <w:t xml:space="preserve">4</w:t>
+      </w:r>
+      <w:r>
+        <w:br/>
+      </w:r>
+      <w:r>
+        <w:rPr>
+          <w:rStyle w:val="VerbatimChar"/>
+        </w:rPr>
+        <w:t xml:space="preserve">-4</w:t>
+      </w:r>
+      <w:r>
+        <w:br/>
+      </w:r>
+      <w:r>
+        <w:rPr>
+          <w:rStyle w:val="VerbatimChar"/>
+        </w:rPr>
+        <w:t xml:space="preserve">5</w:t>
+      </w:r>
+      <w:r>
+        <w:br/>
+      </w:r>
+      <w:r>
+        <w:rPr>
+          <w:rStyle w:val="VerbatimChar"/>
+        </w:rPr>
+        <w:t xml:space="preserve">4</w:t>
       </w:r>
     </w:p>
     <w:bookmarkEnd w:id="35"/>
@@ -2078,6 +2201,62 @@
           <w:rStyle w:val="NormalTok"/>
         </w:rPr>
         <w:t xml:space="preserve">(ipc))</w:t>
+      </w:r>
+    </w:p>
+    <w:p>
+      <w:pPr>
+        <w:pStyle w:val="SourceCode"/>
+      </w:pPr>
+      <w:r>
+        <w:rPr>
+          <w:rStyle w:val="VerbatimChar"/>
+        </w:rPr>
+        <w:t xml:space="preserve">Cálculo del Índice de Precios al Consumidor</w:t>
+      </w:r>
+      <w:r>
+        <w:br/>
+      </w:r>
+      <w:r>
+        <w:rPr>
+          <w:rStyle w:val="VerbatimChar"/>
+        </w:rPr>
+        <w:t xml:space="preserve">Año base: 2020</w:t>
+      </w:r>
+      <w:r>
+        <w:br/>
+      </w:r>
+      <w:r>
+        <w:rPr>
+          <w:rStyle w:val="VerbatimChar"/>
+        </w:rPr>
+        <w:t xml:space="preserve">Precio canasta base: S/ 750.0</w:t>
+      </w:r>
+      <w:r>
+        <w:br/>
+      </w:r>
+      <w:r>
+        <w:rPr>
+          <w:rStyle w:val="VerbatimChar"/>
+        </w:rPr>
+        <w:t xml:space="preserve">Precio canasta actual: S/ 850.5</w:t>
+      </w:r>
+      <w:r>
+        <w:br/>
+      </w:r>
+      <w:r>
+        <w:rPr>
+          <w:rStyle w:val="VerbatimChar"/>
+        </w:rPr>
+        <w:t xml:space="preserve">IPC: 113.4</w:t>
+      </w:r>
+      <w:r>
+        <w:br/>
+      </w:r>
+      <w:r>
+        <w:rPr>
+          <w:rStyle w:val="VerbatimChar"/>
+        </w:rPr>
+        <w:t xml:space="preserve">Tipo de dato del IPC: &lt;class 'float'&gt;</w:t>
       </w:r>
     </w:p>
     <w:bookmarkEnd w:id="36"/>
@@ -3171,6 +3350,44 @@
         <w:t xml:space="preserve">)</w:t>
       </w:r>
     </w:p>
+    <w:p>
+      <w:pPr>
+        <w:pStyle w:val="SourceCode"/>
+      </w:pPr>
+      <w:r>
+        <w:rPr>
+          <w:rStyle w:val="VerbatimChar"/>
+        </w:rPr>
+        <w:t xml:space="preserve">Precio unitario: S/ 25.50</w:t>
+      </w:r>
+      <w:r>
+        <w:br/>
+      </w:r>
+      <w:r>
+        <w:rPr>
+          <w:rStyle w:val="VerbatimChar"/>
+        </w:rPr>
+        <w:t xml:space="preserve">Cantidad vendida: 120 unidades</w:t>
+      </w:r>
+      <w:r>
+        <w:br/>
+      </w:r>
+      <w:r>
+        <w:rPr>
+          <w:rStyle w:val="VerbatimChar"/>
+        </w:rPr>
+        <w:t xml:space="preserve">Subtotal (cálculo intermedio): S/ 3,060.00</w:t>
+      </w:r>
+      <w:r>
+        <w:br/>
+      </w:r>
+      <w:r>
+        <w:rPr>
+          <w:rStyle w:val="VerbatimChar"/>
+        </w:rPr>
+        <w:t xml:space="preserve">Valor temporal interno: 100</w:t>
+      </w:r>
+    </w:p>
     <w:bookmarkEnd w:id="40"/>
     <w:bookmarkStart w:id="41" w:name="nombres-descriptivos-vs.-cortos"/>
     <w:p>
@@ -3468,6 +3685,98 @@
           <w:rStyle w:val="NormalTok"/>
         </w:rPr>
         <w:t xml:space="preserve">(i)</w:t>
+      </w:r>
+    </w:p>
+    <w:p>
+      <w:pPr>
+        <w:pStyle w:val="SourceCode"/>
+      </w:pPr>
+      <w:r>
+        <w:rPr>
+          <w:rStyle w:val="VerbatimChar"/>
+        </w:rPr>
+        <w:t xml:space="preserve">0</w:t>
+      </w:r>
+      <w:r>
+        <w:br/>
+      </w:r>
+      <w:r>
+        <w:rPr>
+          <w:rStyle w:val="VerbatimChar"/>
+        </w:rPr>
+        <w:t xml:space="preserve">1</w:t>
+      </w:r>
+      <w:r>
+        <w:br/>
+      </w:r>
+      <w:r>
+        <w:rPr>
+          <w:rStyle w:val="VerbatimChar"/>
+        </w:rPr>
+        <w:t xml:space="preserve">2</w:t>
+      </w:r>
+      <w:r>
+        <w:br/>
+      </w:r>
+      <w:r>
+        <w:rPr>
+          <w:rStyle w:val="VerbatimChar"/>
+        </w:rPr>
+        <w:t xml:space="preserve">3</w:t>
+      </w:r>
+      <w:r>
+        <w:br/>
+      </w:r>
+      <w:r>
+        <w:rPr>
+          <w:rStyle w:val="VerbatimChar"/>
+        </w:rPr>
+        <w:t xml:space="preserve">4</w:t>
+      </w:r>
+      <w:r>
+        <w:br/>
+      </w:r>
+      <w:r>
+        <w:rPr>
+          <w:rStyle w:val="VerbatimChar"/>
+        </w:rPr>
+        <w:t xml:space="preserve">5</w:t>
+      </w:r>
+      <w:r>
+        <w:br/>
+      </w:r>
+      <w:r>
+        <w:rPr>
+          <w:rStyle w:val="VerbatimChar"/>
+        </w:rPr>
+        <w:t xml:space="preserve">6</w:t>
+      </w:r>
+      <w:r>
+        <w:br/>
+      </w:r>
+      <w:r>
+        <w:rPr>
+          <w:rStyle w:val="VerbatimChar"/>
+        </w:rPr>
+        <w:t xml:space="preserve">7</w:t>
+      </w:r>
+      <w:r>
+        <w:br/>
+      </w:r>
+      <w:r>
+        <w:rPr>
+          <w:rStyle w:val="VerbatimChar"/>
+        </w:rPr>
+        <w:t xml:space="preserve">8</w:t>
+      </w:r>
+      <w:r>
+        <w:br/>
+      </w:r>
+      <w:r>
+        <w:rPr>
+          <w:rStyle w:val="VerbatimChar"/>
+        </w:rPr>
+        <w:t xml:space="preserve">9</w:t>
       </w:r>
     </w:p>
     <w:bookmarkEnd w:id="41"/>
@@ -4215,6 +4524,53 @@
           <w:rStyle w:val="NormalTok"/>
         </w:rPr>
         <w:t xml:space="preserve">)</w:t>
+      </w:r>
+    </w:p>
+    <w:p>
+      <w:pPr>
+        <w:pStyle w:val="SourceCode"/>
+      </w:pPr>
+      <w:r>
+        <w:rPr>
+          <w:rStyle w:val="VerbatimChar"/>
+        </w:rPr>
+        <w:t xml:space="preserve">Análisis Económico - Perú (PER)</w:t>
+      </w:r>
+      <w:r>
+        <w:br/>
+      </w:r>
+      <w:r>
+        <w:rPr>
+          <w:rStyle w:val="VerbatimChar"/>
+        </w:rPr>
+        <w:t xml:space="preserve">PIB nominal: USD 242,632 millones</w:t>
+      </w:r>
+      <w:r>
+        <w:br/>
+      </w:r>
+      <w:r>
+        <w:rPr>
+          <w:rStyle w:val="VerbatimChar"/>
+        </w:rPr>
+        <w:t xml:space="preserve">Población: 33,715,471 habitantes</w:t>
+      </w:r>
+      <w:r>
+        <w:br/>
+      </w:r>
+      <w:r>
+        <w:rPr>
+          <w:rStyle w:val="VerbatimChar"/>
+        </w:rPr>
+        <w:t xml:space="preserve">PIB per cápita: USD 7,196.46</w:t>
+      </w:r>
+      <w:r>
+        <w:br/>
+      </w:r>
+      <w:r>
+        <w:rPr>
+          <w:rStyle w:val="VerbatimChar"/>
+        </w:rPr>
+        <w:t xml:space="preserve">Economía emergente: True</w:t>
       </w:r>
     </w:p>
     <w:bookmarkEnd w:id="42"/>
@@ -5174,6 +5530,71 @@
         <w:t xml:space="preserve"># 25</w:t>
       </w:r>
     </w:p>
+    <w:p>
+      <w:pPr>
+        <w:pStyle w:val="SourceCode"/>
+      </w:pPr>
+      <w:r>
+        <w:rPr>
+          <w:rStyle w:val="VerbatimChar"/>
+        </w:rPr>
+        <w:t xml:space="preserve">Ingreso total: 10500</w:t>
+      </w:r>
+      <w:r>
+        <w:br/>
+      </w:r>
+      <w:r>
+        <w:rPr>
+          <w:rStyle w:val="VerbatimChar"/>
+        </w:rPr>
+        <w:t xml:space="preserve">Ahorro: 1000</w:t>
+      </w:r>
+      <w:r>
+        <w:br/>
+      </w:r>
+      <w:r>
+        <w:rPr>
+          <w:rStyle w:val="VerbatimChar"/>
+        </w:rPr>
+        <w:t xml:space="preserve">Valor de venta: 2550.0</w:t>
+      </w:r>
+      <w:r>
+        <w:br/>
+      </w:r>
+      <w:r>
+        <w:rPr>
+          <w:rStyle w:val="VerbatimChar"/>
+        </w:rPr>
+        <w:t xml:space="preserve">PIB per cápita: 10.0</w:t>
+      </w:r>
+      <w:r>
+        <w:br/>
+      </w:r>
+      <w:r>
+        <w:rPr>
+          <w:rStyle w:val="VerbatimChar"/>
+        </w:rPr>
+        <w:t xml:space="preserve">Capital final: 11576.25</w:t>
+      </w:r>
+      <w:r>
+        <w:br/>
+      </w:r>
+      <w:r>
+        <w:rPr>
+          <w:rStyle w:val="VerbatimChar"/>
+        </w:rPr>
+        <w:t xml:space="preserve">Lotes completos: 13</w:t>
+      </w:r>
+      <w:r>
+        <w:br/>
+      </w:r>
+      <w:r>
+        <w:rPr>
+          <w:rStyle w:val="VerbatimChar"/>
+        </w:rPr>
+        <w:t xml:space="preserve">Unidades restantes: 25</w:t>
+      </w:r>
+    </w:p>
     <w:bookmarkEnd w:id="44"/>
     <w:bookmarkStart w:id="45" w:name="operadores-de-comparación"/>
     <w:p>
@@ -5579,6 +6000,62 @@
           <w:rStyle w:val="CommentTok"/>
         </w:rPr>
         <w:t xml:space="preserve"># False</w:t>
+      </w:r>
+    </w:p>
+    <w:p>
+      <w:pPr>
+        <w:pStyle w:val="SourceCode"/>
+      </w:pPr>
+      <w:r>
+        <w:rPr>
+          <w:rStyle w:val="VerbatimChar"/>
+        </w:rPr>
+        <w:t xml:space="preserve">False</w:t>
+      </w:r>
+      <w:r>
+        <w:br/>
+      </w:r>
+      <w:r>
+        <w:rPr>
+          <w:rStyle w:val="VerbatimChar"/>
+        </w:rPr>
+        <w:t xml:space="preserve">True</w:t>
+      </w:r>
+      <w:r>
+        <w:br/>
+      </w:r>
+      <w:r>
+        <w:rPr>
+          <w:rStyle w:val="VerbatimChar"/>
+        </w:rPr>
+        <w:t xml:space="preserve">True</w:t>
+      </w:r>
+      <w:r>
+        <w:br/>
+      </w:r>
+      <w:r>
+        <w:rPr>
+          <w:rStyle w:val="VerbatimChar"/>
+        </w:rPr>
+        <w:t xml:space="preserve">False</w:t>
+      </w:r>
+      <w:r>
+        <w:br/>
+      </w:r>
+      <w:r>
+        <w:rPr>
+          <w:rStyle w:val="VerbatimChar"/>
+        </w:rPr>
+        <w:t xml:space="preserve">True</w:t>
+      </w:r>
+      <w:r>
+        <w:br/>
+      </w:r>
+      <w:r>
+        <w:rPr>
+          <w:rStyle w:val="VerbatimChar"/>
+        </w:rPr>
+        <w:t xml:space="preserve">False</w:t>
       </w:r>
     </w:p>
     <w:bookmarkEnd w:id="45"/>
@@ -6084,6 +6561,35 @@
         <w:t xml:space="preserve"># False</w:t>
       </w:r>
     </w:p>
+    <w:p>
+      <w:pPr>
+        <w:pStyle w:val="SourceCode"/>
+      </w:pPr>
+      <w:r>
+        <w:rPr>
+          <w:rStyle w:val="VerbatimChar"/>
+        </w:rPr>
+        <w:t xml:space="preserve">Economía estable: True</w:t>
+      </w:r>
+      <w:r>
+        <w:br/>
+      </w:r>
+      <w:r>
+        <w:rPr>
+          <w:rStyle w:val="VerbatimChar"/>
+        </w:rPr>
+        <w:t xml:space="preserve">Hay problema económico: False</w:t>
+      </w:r>
+      <w:r>
+        <w:br/>
+      </w:r>
+      <w:r>
+        <w:rPr>
+          <w:rStyle w:val="VerbatimChar"/>
+        </w:rPr>
+        <w:t xml:space="preserve">En recesión: False</w:t>
+      </w:r>
+    </w:p>
     <w:bookmarkEnd w:id="46"/>
     <w:bookmarkStart w:id="47" w:name="operadores-de-asignación"/>
     <w:p>
@@ -6585,6 +7091,53 @@
           <w:rStyle w:val="CommentTok"/>
         </w:rPr>
         <w:t xml:space="preserve"># 8</w:t>
+      </w:r>
+    </w:p>
+    <w:p>
+      <w:pPr>
+        <w:pStyle w:val="SourceCode"/>
+      </w:pPr>
+      <w:r>
+        <w:rPr>
+          <w:rStyle w:val="VerbatimChar"/>
+        </w:rPr>
+        <w:t xml:space="preserve">Capital después de aporte: 11500</w:t>
+      </w:r>
+      <w:r>
+        <w:br/>
+      </w:r>
+      <w:r>
+        <w:rPr>
+          <w:rStyle w:val="VerbatimChar"/>
+        </w:rPr>
+        <w:t xml:space="preserve">Capital después de retiro: 9500</w:t>
+      </w:r>
+      <w:r>
+        <w:br/>
+      </w:r>
+      <w:r>
+        <w:rPr>
+          <w:rStyle w:val="VerbatimChar"/>
+        </w:rPr>
+        <w:t xml:space="preserve">Capital con interés: 9975.0</w:t>
+      </w:r>
+      <w:r>
+        <w:br/>
+      </w:r>
+      <w:r>
+        <w:rPr>
+          <w:rStyle w:val="VerbatimChar"/>
+        </w:rPr>
+        <w:t xml:space="preserve">Capital dividido: 4987.5</w:t>
+      </w:r>
+      <w:r>
+        <w:br/>
+      </w:r>
+      <w:r>
+        <w:rPr>
+          <w:rStyle w:val="VerbatimChar"/>
+        </w:rPr>
+        <w:t xml:space="preserve">Tasa al cubo: 8</w:t>
       </w:r>
     </w:p>
     <w:bookmarkEnd w:id="47"/>
@@ -7272,6 +7825,71 @@
           <w:rStyle w:val="NormalTok"/>
         </w:rPr>
         <w:t xml:space="preserve">)</w:t>
+      </w:r>
+    </w:p>
+    <w:p>
+      <w:pPr>
+        <w:pStyle w:val="SourceCode"/>
+      </w:pPr>
+      <w:r>
+        <w:rPr>
+          <w:rStyle w:val="VerbatimChar"/>
+        </w:rPr>
+        <w:t xml:space="preserve">Préstamo con Interés Compuesto</w:t>
+      </w:r>
+      <w:r>
+        <w:br/>
+      </w:r>
+      <w:r>
+        <w:rPr>
+          <w:rStyle w:val="VerbatimChar"/>
+        </w:rPr>
+        <w:t xml:space="preserve">Capital inicial: S/ 50,000.00</w:t>
+      </w:r>
+      <w:r>
+        <w:br/>
+      </w:r>
+      <w:r>
+        <w:rPr>
+          <w:rStyle w:val="VerbatimChar"/>
+        </w:rPr>
+        <w:t xml:space="preserve">Tasa anual: 8.0%</w:t>
+      </w:r>
+      <w:r>
+        <w:br/>
+      </w:r>
+      <w:r>
+        <w:rPr>
+          <w:rStyle w:val="VerbatimChar"/>
+        </w:rPr>
+        <w:t xml:space="preserve">Periodo: 5 años</w:t>
+      </w:r>
+      <w:r>
+        <w:br/>
+      </w:r>
+      <w:r>
+        <w:rPr>
+          <w:rStyle w:val="VerbatimChar"/>
+        </w:rPr>
+        <w:t xml:space="preserve">Capital final (método 1): S/ 73,466.40</w:t>
+      </w:r>
+      <w:r>
+        <w:br/>
+      </w:r>
+      <w:r>
+        <w:rPr>
+          <w:rStyle w:val="VerbatimChar"/>
+        </w:rPr>
+        <w:t xml:space="preserve">Capital final (método 2): S/ 73,466.40</w:t>
+      </w:r>
+      <w:r>
+        <w:br/>
+      </w:r>
+      <w:r>
+        <w:rPr>
+          <w:rStyle w:val="VerbatimChar"/>
+        </w:rPr>
+        <w:t xml:space="preserve">Intereses ganados: S/ 23,466.40</w:t>
       </w:r>
     </w:p>
     <w:bookmarkEnd w:id="48"/>
@@ -7967,6 +8585,26 @@
         <w:t xml:space="preserve"># 2.00</w:t>
       </w:r>
     </w:p>
+    <w:p>
+      <w:pPr>
+        <w:pStyle w:val="SourceCode"/>
+      </w:pPr>
+      <w:r>
+        <w:rPr>
+          <w:rStyle w:val="VerbatimChar"/>
+        </w:rPr>
+        <w:t xml:space="preserve">Propensión marginal al consumo: 0.5</w:t>
+      </w:r>
+      <w:r>
+        <w:br/>
+      </w:r>
+      <w:r>
+        <w:rPr>
+          <w:rStyle w:val="VerbatimChar"/>
+        </w:rPr>
+        <w:t xml:space="preserve">Multiplicador keynesiano: 2.00</w:t>
+      </w:r>
+    </w:p>
     <w:bookmarkEnd w:id="51"/>
     <w:bookmarkStart w:id="52" w:name="expresiones-en-contexto-económico"/>
     <w:p>
@@ -8709,6 +9347,44 @@
           <w:rStyle w:val="NormalTok"/>
         </w:rPr>
         <w:t xml:space="preserve">)</w:t>
+      </w:r>
+    </w:p>
+    <w:p>
+      <w:pPr>
+        <w:pStyle w:val="SourceCode"/>
+      </w:pPr>
+      <w:r>
+        <w:rPr>
+          <w:rStyle w:val="VerbatimChar"/>
+        </w:rPr>
+        <w:t xml:space="preserve">Variación del precio: 10.00%</w:t>
+      </w:r>
+      <w:r>
+        <w:br/>
+      </w:r>
+      <w:r>
+        <w:rPr>
+          <w:rStyle w:val="VerbatimChar"/>
+        </w:rPr>
+        <w:t xml:space="preserve">Variación de la cantidad: -5.00%</w:t>
+      </w:r>
+      <w:r>
+        <w:br/>
+      </w:r>
+      <w:r>
+        <w:rPr>
+          <w:rStyle w:val="VerbatimChar"/>
+        </w:rPr>
+        <w:t xml:space="preserve">Elasticidad precio de la demanda: -0.50</w:t>
+      </w:r>
+      <w:r>
+        <w:br/>
+      </w:r>
+      <w:r>
+        <w:rPr>
+          <w:rStyle w:val="VerbatimChar"/>
+        </w:rPr>
+        <w:t xml:space="preserve">La demanda es inelástica</w:t>
       </w:r>
     </w:p>
     <w:bookmarkEnd w:id="52"/>
@@ -9518,6 +10194,44 @@
         <w:t xml:space="preserve"># 50 (mismo resultado pero más claro)</w:t>
       </w:r>
     </w:p>
+    <w:p>
+      <w:pPr>
+        <w:pStyle w:val="SourceCode"/>
+      </w:pPr>
+      <w:r>
+        <w:rPr>
+          <w:rStyle w:val="VerbatimChar"/>
+        </w:rPr>
+        <w:t xml:space="preserve">14</w:t>
+      </w:r>
+      <w:r>
+        <w:br/>
+      </w:r>
+      <w:r>
+        <w:rPr>
+          <w:rStyle w:val="VerbatimChar"/>
+        </w:rPr>
+        <w:t xml:space="preserve">20</w:t>
+      </w:r>
+      <w:r>
+        <w:br/>
+      </w:r>
+      <w:r>
+        <w:rPr>
+          <w:rStyle w:val="VerbatimChar"/>
+        </w:rPr>
+        <w:t xml:space="preserve">50</w:t>
+      </w:r>
+      <w:r>
+        <w:br/>
+      </w:r>
+      <w:r>
+        <w:rPr>
+          <w:rStyle w:val="VerbatimChar"/>
+        </w:rPr>
+        <w:t xml:space="preserve">50</w:t>
+      </w:r>
+    </w:p>
     <w:bookmarkEnd w:id="55"/>
     <w:bookmarkStart w:id="56" w:name="X5112952764fc43043c568df731a8f8b21159dbc"/>
     <w:p>
@@ -10245,6 +10959,35 @@
           <w:rStyle w:val="NormalTok"/>
         </w:rPr>
         <w:t xml:space="preserve">)</w:t>
+      </w:r>
+    </w:p>
+    <w:p>
+      <w:pPr>
+        <w:pStyle w:val="SourceCode"/>
+      </w:pPr>
+      <w:r>
+        <w:rPr>
+          <w:rStyle w:val="VerbatimChar"/>
+        </w:rPr>
+        <w:t xml:space="preserve">Inversión inicial: S/ 100,000.00</w:t>
+      </w:r>
+      <w:r>
+        <w:br/>
+      </w:r>
+      <w:r>
+        <w:rPr>
+          <w:rStyle w:val="VerbatimChar"/>
+        </w:rPr>
+        <w:t xml:space="preserve">VPN del proyecto: S/ -2,103.68</w:t>
+      </w:r>
+      <w:r>
+        <w:br/>
+      </w:r>
+      <w:r>
+        <w:rPr>
+          <w:rStyle w:val="VerbatimChar"/>
+        </w:rPr>
+        <w:t xml:space="preserve">Decisión: Rechazar el proyecto</w:t>
       </w:r>
     </w:p>
     <w:bookmarkEnd w:id="56"/>
@@ -10634,6 +11377,17 @@
           <w:rStyle w:val="NormalTok"/>
         </w:rPr>
         <w:t xml:space="preserve">)</w:t>
+      </w:r>
+    </w:p>
+    <w:p>
+      <w:pPr>
+        <w:pStyle w:val="SourceCode"/>
+      </w:pPr>
+      <w:r>
+        <w:rPr>
+          <w:rStyle w:val="VerbatimChar"/>
+        </w:rPr>
+        <w:t xml:space="preserve">Tasa efectiva anual: 12.68%</w:t>
       </w:r>
     </w:p>
     <w:bookmarkEnd w:id="57"/>
@@ -11002,6 +11756,26 @@
         <w:t xml:space="preserve">(presentacion)</w:t>
       </w:r>
     </w:p>
+    <w:p>
+      <w:pPr>
+        <w:pStyle w:val="SourceCode"/>
+      </w:pPr>
+      <w:r>
+        <w:rPr>
+          <w:rStyle w:val="VerbatimChar"/>
+        </w:rPr>
+        <w:t xml:space="preserve">Perú está ubicado en América del Sur</w:t>
+      </w:r>
+      <w:r>
+        <w:br/>
+      </w:r>
+      <w:r>
+        <w:rPr>
+          <w:rStyle w:val="VerbatimChar"/>
+        </w:rPr>
+        <w:t xml:space="preserve">Edison Achalma, Economista</w:t>
+      </w:r>
+    </w:p>
     <w:bookmarkEnd w:id="59"/>
     <w:bookmarkStart w:id="60" w:name="repetición-de-strings"/>
     <w:p>
@@ -11240,6 +12014,44 @@
           <w:rStyle w:val="NormalTok"/>
         </w:rPr>
         <w:t xml:space="preserve">)</w:t>
+      </w:r>
+    </w:p>
+    <w:p>
+      <w:pPr>
+        <w:pStyle w:val="SourceCode"/>
+      </w:pPr>
+      <w:r>
+        <w:rPr>
+          <w:rStyle w:val="VerbatimChar"/>
+        </w:rPr>
+        <w:t xml:space="preserve">--------------------------------------------------</w:t>
+      </w:r>
+      <w:r>
+        <w:br/>
+      </w:r>
+      <w:r>
+        <w:rPr>
+          <w:rStyle w:val="VerbatimChar"/>
+        </w:rPr>
+        <w:t xml:space="preserve">========================================</w:t>
+      </w:r>
+      <w:r>
+        <w:br/>
+      </w:r>
+      <w:r>
+        <w:rPr>
+          <w:rStyle w:val="VerbatimChar"/>
+        </w:rPr>
+        <w:t xml:space="preserve">           REPORTE ECONÓMICO            </w:t>
+      </w:r>
+      <w:r>
+        <w:br/>
+      </w:r>
+      <w:r>
+        <w:rPr>
+          <w:rStyle w:val="VerbatimChar"/>
+        </w:rPr>
+        <w:t xml:space="preserve">========================================</w:t>
       </w:r>
     </w:p>
     <w:bookmarkEnd w:id="60"/>
@@ -11621,6 +12433,35 @@
     </w:p>
     <w:p>
       <w:pPr>
+        <w:pStyle w:val="SourceCode"/>
+      </w:pPr>
+      <w:r>
+        <w:rPr>
+          <w:rStyle w:val="VerbatimChar"/>
+        </w:rPr>
+        <w:t xml:space="preserve">El PIB de Perú es USD 242632 millones</w:t>
+      </w:r>
+      <w:r>
+        <w:br/>
+      </w:r>
+      <w:r>
+        <w:rPr>
+          <w:rStyle w:val="VerbatimChar"/>
+        </w:rPr>
+        <w:t xml:space="preserve">La inflación es 3.25%</w:t>
+      </w:r>
+      <w:r>
+        <w:br/>
+      </w:r>
+      <w:r>
+        <w:rPr>
+          <w:rStyle w:val="VerbatimChar"/>
+        </w:rPr>
+        <w:t xml:space="preserve">Edison tiene 30 años</w:t>
+      </w:r>
+    </w:p>
+    <w:p>
+      <w:pPr>
         <w:pStyle w:val="FirstParagraph"/>
       </w:pPr>
       <w:r>
@@ -12139,6 +12980,53 @@
     </w:p>
     <w:p>
       <w:pPr>
+        <w:pStyle w:val="SourceCode"/>
+      </w:pPr>
+      <w:r>
+        <w:rPr>
+          <w:rStyle w:val="VerbatimChar"/>
+        </w:rPr>
+        <w:t xml:space="preserve">El PIB de Perú es USD 242632 millones</w:t>
+      </w:r>
+      <w:r>
+        <w:br/>
+      </w:r>
+      <w:r>
+        <w:rPr>
+          <w:rStyle w:val="VerbatimChar"/>
+        </w:rPr>
+        <w:t xml:space="preserve">El PIB de Perú es USD 242632 millones. Perú es un país emergente.</w:t>
+      </w:r>
+      <w:r>
+        <w:br/>
+      </w:r>
+      <w:r>
+        <w:rPr>
+          <w:rStyle w:val="VerbatimChar"/>
+        </w:rPr>
+        <w:t xml:space="preserve">El PIB de Perú es USD 242632 millones</w:t>
+      </w:r>
+      <w:r>
+        <w:br/>
+      </w:r>
+      <w:r>
+        <w:rPr>
+          <w:rStyle w:val="VerbatimChar"/>
+        </w:rPr>
+        <w:t xml:space="preserve">Inflación: 3.25%</w:t>
+      </w:r>
+      <w:r>
+        <w:br/>
+      </w:r>
+      <w:r>
+        <w:rPr>
+          <w:rStyle w:val="VerbatimChar"/>
+        </w:rPr>
+        <w:t xml:space="preserve">PIB: USD 242,632,000,000</w:t>
+      </w:r>
+    </w:p>
+    <w:p>
+      <w:pPr>
         <w:pStyle w:val="FirstParagraph"/>
       </w:pPr>
       <w:r>
@@ -12722,6 +13610,53 @@
           <w:rStyle w:val="NormalTok"/>
         </w:rPr>
         <w:t xml:space="preserve">)</w:t>
+      </w:r>
+    </w:p>
+    <w:p>
+      <w:pPr>
+        <w:pStyle w:val="SourceCode"/>
+      </w:pPr>
+      <w:r>
+        <w:rPr>
+          <w:rStyle w:val="VerbatimChar"/>
+        </w:rPr>
+        <w:t xml:space="preserve">El PIB de Perú es USD 242632 millones</w:t>
+      </w:r>
+      <w:r>
+        <w:br/>
+      </w:r>
+      <w:r>
+        <w:rPr>
+          <w:rStyle w:val="VerbatimChar"/>
+        </w:rPr>
+        <w:t xml:space="preserve">PIB per cápita: USD 7196.46</w:t>
+      </w:r>
+      <w:r>
+        <w:br/>
+      </w:r>
+      <w:r>
+        <w:rPr>
+          <w:rStyle w:val="VerbatimChar"/>
+        </w:rPr>
+        <w:t xml:space="preserve">Inflación: 3.25%</w:t>
+      </w:r>
+      <w:r>
+        <w:br/>
+      </w:r>
+      <w:r>
+        <w:rPr>
+          <w:rStyle w:val="VerbatimChar"/>
+        </w:rPr>
+        <w:t xml:space="preserve">Población: 33,715,471 habitantes</w:t>
+      </w:r>
+      <w:r>
+        <w:br/>
+      </w:r>
+      <w:r>
+        <w:rPr>
+          <w:rStyle w:val="VerbatimChar"/>
+        </w:rPr>
+        <w:t xml:space="preserve">Valor total: S/ 5,000.00</w:t>
       </w:r>
     </w:p>
     <w:bookmarkEnd w:id="61"/>
@@ -13369,6 +14304,80 @@
         <w:t xml:space="preserve"># 'PIB'</w:t>
       </w:r>
     </w:p>
+    <w:p>
+      <w:pPr>
+        <w:pStyle w:val="SourceCode"/>
+      </w:pPr>
+      <w:r>
+        <w:rPr>
+          <w:rStyle w:val="VerbatimChar"/>
+        </w:rPr>
+        <w:t xml:space="preserve">AGRICULTURA, GANADERÍA Y PESCA</w:t>
+      </w:r>
+      <w:r>
+        <w:br/>
+      </w:r>
+      <w:r>
+        <w:rPr>
+          <w:rStyle w:val="VerbatimChar"/>
+        </w:rPr>
+        <w:t xml:space="preserve">producto bruto interno</w:t>
+      </w:r>
+      <w:r>
+        <w:br/>
+      </w:r>
+      <w:r>
+        <w:rPr>
+          <w:rStyle w:val="VerbatimChar"/>
+        </w:rPr>
+        <w:t xml:space="preserve">Agricultura, Ganadería Y Pesca</w:t>
+      </w:r>
+      <w:r>
+        <w:br/>
+      </w:r>
+      <w:r>
+        <w:rPr>
+          <w:rStyle w:val="VerbatimChar"/>
+        </w:rPr>
+        <w:t xml:space="preserve">Agricultura, ganadería y pesca</w:t>
+      </w:r>
+      <w:r>
+        <w:br/>
+      </w:r>
+      <w:r>
+        <w:rPr>
+          <w:rStyle w:val="VerbatimChar"/>
+        </w:rPr>
+        <w:t xml:space="preserve">La tasa de interés es 6%</w:t>
+      </w:r>
+      <w:r>
+        <w:br/>
+      </w:r>
+      <w:r>
+        <w:rPr>
+          <w:rStyle w:val="VerbatimChar"/>
+        </w:rPr>
+        <w:t xml:space="preserve">['Minería', 'Agricultura', 'Manufactura', 'Servicios']</w:t>
+      </w:r>
+      <w:r>
+        <w:br/>
+      </w:r>
+      <w:r>
+        <w:rPr>
+          <w:rStyle w:val="VerbatimChar"/>
+        </w:rPr>
+        <w:t xml:space="preserve">Producto Bruto Interno</w:t>
+      </w:r>
+      <w:r>
+        <w:br/>
+      </w:r>
+      <w:r>
+        <w:rPr>
+          <w:rStyle w:val="VerbatimChar"/>
+        </w:rPr>
+        <w:t xml:space="preserve">'PIB'</w:t>
+      </w:r>
+    </w:p>
     <w:bookmarkEnd w:id="62"/>
     <w:bookmarkStart w:id="63" w:name="indexación-y-slicing-de-strings"/>
     <w:p>
@@ -13852,6 +14861,107 @@
           <w:rStyle w:val="CommentTok"/>
         </w:rPr>
         <w:t xml:space="preserve"># ONRETNI OTURB OTCUDORP (invertido)</w:t>
+      </w:r>
+    </w:p>
+    <w:p>
+      <w:pPr>
+        <w:pStyle w:val="SourceCode"/>
+      </w:pPr>
+      <w:r>
+        <w:rPr>
+          <w:rStyle w:val="VerbatimChar"/>
+        </w:rPr>
+        <w:t xml:space="preserve">P</w:t>
+      </w:r>
+      <w:r>
+        <w:br/>
+      </w:r>
+      <w:r>
+        <w:rPr>
+          <w:rStyle w:val="VerbatimChar"/>
+        </w:rPr>
+        <w:t xml:space="preserve">R</w:t>
+      </w:r>
+      <w:r>
+        <w:br/>
+      </w:r>
+      <w:r>
+        <w:rPr>
+          <w:rStyle w:val="VerbatimChar"/>
+        </w:rPr>
+        <w:t xml:space="preserve">O</w:t>
+      </w:r>
+      <w:r>
+        <w:br/>
+      </w:r>
+      <w:r>
+        <w:rPr>
+          <w:rStyle w:val="VerbatimChar"/>
+        </w:rPr>
+        <w:t xml:space="preserve">N</w:t>
+      </w:r>
+      <w:r>
+        <w:br/>
+      </w:r>
+      <w:r>
+        <w:rPr>
+          <w:rStyle w:val="VerbatimChar"/>
+        </w:rPr>
+        <w:t xml:space="preserve">PRODUCTO</w:t>
+      </w:r>
+      <w:r>
+        <w:br/>
+      </w:r>
+      <w:r>
+        <w:rPr>
+          <w:rStyle w:val="VerbatimChar"/>
+        </w:rPr>
+        <w:t xml:space="preserve">PRODUCTO</w:t>
+      </w:r>
+      <w:r>
+        <w:br/>
+      </w:r>
+      <w:r>
+        <w:rPr>
+          <w:rStyle w:val="VerbatimChar"/>
+        </w:rPr>
+        <w:t xml:space="preserve">BRUTO</w:t>
+      </w:r>
+      <w:r>
+        <w:br/>
+      </w:r>
+      <w:r>
+        <w:rPr>
+          <w:rStyle w:val="VerbatimChar"/>
+        </w:rPr>
+        <w:t xml:space="preserve">INTERNO</w:t>
+      </w:r>
+      <w:r>
+        <w:br/>
+      </w:r>
+      <w:r>
+        <w:rPr>
+          <w:rStyle w:val="VerbatimChar"/>
+        </w:rPr>
+        <w:t xml:space="preserve">PRODUCTO BRUTO INTERNO</w:t>
+      </w:r>
+      <w:r>
+        <w:br/>
+      </w:r>
+      <w:r>
+        <w:rPr>
+          <w:rStyle w:val="VerbatimChar"/>
+        </w:rPr>
+        <w:t xml:space="preserve">POUT RT NEN</w:t>
+      </w:r>
+      <w:r>
+        <w:br/>
+      </w:r>
+      <w:r>
+        <w:rPr>
+          <w:rStyle w:val="VerbatimChar"/>
+        </w:rPr>
+        <w:t xml:space="preserve">ONRETNI OTURB OTCUDORP</w:t>
       </w:r>
     </w:p>
     <w:bookmarkEnd w:id="63"/>
@@ -14358,6 +15468,89 @@
         <w:t xml:space="preserve"># True</w:t>
       </w:r>
     </w:p>
+    <w:p>
+      <w:pPr>
+        <w:pStyle w:val="SourceCode"/>
+      </w:pPr>
+      <w:r>
+        <w:rPr>
+          <w:rStyle w:val="VerbatimChar"/>
+        </w:rPr>
+        <w:t xml:space="preserve">True</w:t>
+      </w:r>
+      <w:r>
+        <w:br/>
+      </w:r>
+      <w:r>
+        <w:rPr>
+          <w:rStyle w:val="VerbatimChar"/>
+        </w:rPr>
+        <w:t xml:space="preserve">False</w:t>
+      </w:r>
+      <w:r>
+        <w:br/>
+      </w:r>
+      <w:r>
+        <w:rPr>
+          <w:rStyle w:val="VerbatimChar"/>
+        </w:rPr>
+        <w:t xml:space="preserve">True</w:t>
+      </w:r>
+      <w:r>
+        <w:br/>
+      </w:r>
+      <w:r>
+        <w:rPr>
+          <w:rStyle w:val="VerbatimChar"/>
+        </w:rPr>
+        <w:t xml:space="preserve">True</w:t>
+      </w:r>
+      <w:r>
+        <w:br/>
+      </w:r>
+      <w:r>
+        <w:rPr>
+          <w:rStyle w:val="VerbatimChar"/>
+        </w:rPr>
+        <w:t xml:space="preserve">True</w:t>
+      </w:r>
+      <w:r>
+        <w:br/>
+      </w:r>
+      <w:r>
+        <w:rPr>
+          <w:rStyle w:val="VerbatimChar"/>
+        </w:rPr>
+        <w:t xml:space="preserve">False</w:t>
+      </w:r>
+      <w:r>
+        <w:br/>
+      </w:r>
+      <w:r>
+        <w:rPr>
+          <w:rStyle w:val="VerbatimChar"/>
+        </w:rPr>
+        <w:t xml:space="preserve">True</w:t>
+      </w:r>
+      <w:r>
+        <w:br/>
+      </w:r>
+      <w:r>
+        <w:rPr>
+          <w:rStyle w:val="VerbatimChar"/>
+        </w:rPr>
+        <w:t xml:space="preserve">False</w:t>
+      </w:r>
+      <w:r>
+        <w:br/>
+      </w:r>
+      <w:r>
+        <w:rPr>
+          <w:rStyle w:val="VerbatimChar"/>
+        </w:rPr>
+        <w:t xml:space="preserve">True</w:t>
+      </w:r>
+    </w:p>
     <w:bookmarkEnd w:id="64"/>
     <w:bookmarkStart w:id="65" w:name="X587469ed99e523ea4fe71a5048548dc04104739"/>
     <w:p>
@@ -15172,6 +16365,80 @@
           <w:rStyle w:val="NormalTok"/>
         </w:rPr>
         <w:t xml:space="preserve">)</w:t>
+      </w:r>
+    </w:p>
+    <w:p>
+      <w:pPr>
+        <w:pStyle w:val="SourceCode"/>
+      </w:pPr>
+      <w:r>
+        <w:rPr>
+          <w:rStyle w:val="VerbatimChar"/>
+        </w:rPr>
+        <w:t xml:space="preserve">CONTRIBUCIÓN SECTORIAL AL PIB</w:t>
+      </w:r>
+      <w:r>
+        <w:br/>
+      </w:r>
+      <w:r>
+        <w:rPr>
+          <w:rStyle w:val="VerbatimChar"/>
+        </w:rPr>
+        <w:t xml:space="preserve">========================================</w:t>
+      </w:r>
+      <w:r>
+        <w:br/>
+      </w:r>
+      <w:r>
+        <w:rPr>
+          <w:rStyle w:val="VerbatimChar"/>
+        </w:rPr>
+        <w:t xml:space="preserve">Minería           45.2% ██████████████████████</w:t>
+      </w:r>
+      <w:r>
+        <w:br/>
+      </w:r>
+      <w:r>
+        <w:rPr>
+          <w:rStyle w:val="VerbatimChar"/>
+        </w:rPr>
+        <w:t xml:space="preserve">Agricultura       12.8% ██████</w:t>
+      </w:r>
+      <w:r>
+        <w:br/>
+      </w:r>
+      <w:r>
+        <w:rPr>
+          <w:rStyle w:val="VerbatimChar"/>
+        </w:rPr>
+        <w:t xml:space="preserve">Manufactura       23.5% ███████████</w:t>
+      </w:r>
+      <w:r>
+        <w:br/>
+      </w:r>
+      <w:r>
+        <w:rPr>
+          <w:rStyle w:val="VerbatimChar"/>
+        </w:rPr>
+        <w:t xml:space="preserve">Servicios         67.9% █████████████████████████████████</w:t>
+      </w:r>
+      <w:r>
+        <w:br/>
+      </w:r>
+      <w:r>
+        <w:rPr>
+          <w:rStyle w:val="VerbatimChar"/>
+        </w:rPr>
+        <w:t xml:space="preserve">========================================</w:t>
+      </w:r>
+      <w:r>
+        <w:br/>
+      </w:r>
+      <w:r>
+        <w:rPr>
+          <w:rStyle w:val="VerbatimChar"/>
+        </w:rPr>
+        <w:t xml:space="preserve">TOTAL            149.4%</w:t>
       </w:r>
     </w:p>
     <w:bookmarkEnd w:id="65"/>
@@ -19542,6 +20809,17 @@
           <w:rStyle w:val="NormalTok"/>
         </w:rPr>
         <w:t xml:space="preserve">)</w:t>
+      </w:r>
+    </w:p>
+    <w:p>
+      <w:pPr>
+        <w:pStyle w:val="SourceCode"/>
+      </w:pPr>
+      <w:r>
+        <w:rPr>
+          <w:rStyle w:val="VerbatimChar"/>
+        </w:rPr>
+        <w:t xml:space="preserve">Elasticidad: -0.50</w:t>
       </w:r>
     </w:p>
     <w:bookmarkEnd w:id="76"/>
@@ -31063,7 +32341,7 @@
     </w:p>
     <w:bookmarkEnd w:id="90"/>
     <w:bookmarkEnd w:id="91"/>
-    <w:bookmarkStart w:id="118" w:name="publicaciones-similares"/>
+    <w:bookmarkStart w:id="120" w:name="publicaciones-similares"/>
     <w:p>
       <w:pPr>
         <w:pStyle w:val="Heading1"/>
@@ -31349,6 +32627,27 @@
           <w:rPr>
             <w:rStyle w:val="Hyperlink"/>
           </w:rPr>
+          <w:t xml:space="preserve">11 Validacion Cruzada Y Composicion Del Modelo Con Python</w:t>
+        </w:r>
+      </w:hyperlink>
+    </w:p>
+    <w:p>
+      <w:pPr>
+        <w:pStyle w:val="Compact"/>
+        <w:numPr>
+          <w:ilvl w:val="0"/>
+          <w:numId w:val="1005"/>
+        </w:numPr>
+      </w:pPr>
+      <w:hyperlink r:id="rId118"/>
+      <w:r>
+        <w:t xml:space="preserve"> </w:t>
+      </w:r>
+      <w:hyperlink r:id="rId119">
+        <w:r>
+          <w:rPr>
+            <w:rStyle w:val="Hyperlink"/>
+          </w:rPr>
           <w:t xml:space="preserve">Visualizacion De Datos Con Python</w:t>
         </w:r>
       </w:hyperlink>
@@ -31361,7 +32660,7 @@
         <w:t xml:space="preserve">Esperamos que encuentres estas publicaciones igualmente interesantes y útiles. ¡Disfruta de la lectura!</w:t>
       </w:r>
     </w:p>
-    <w:bookmarkEnd w:id="118"/>
+    <w:bookmarkEnd w:id="120"/>
     <w:sectPr>
       <w:headerReference r:id="rId8" w:type="even"/>
       <w:headerReference r:id="rId9" w:type="default"/>

</xml_diff>